<commit_message>
Update topic taskESL2 description
</commit_message>
<xml_diff>
--- a/D21 eStation开发人员手册.docx
+++ b/D21 eStation开发人员手册.docx
@@ -8198,7 +8198,7 @@
           <w:noProof/>
           <w:sz w:val="22"/>
         </w:rPr>
-        <w:object w:dxaOrig="8209" w:dyaOrig="3311" w14:anchorId="695DB642">
+        <w:object w:dxaOrig="8209" w:dyaOrig="3311" w14:anchorId="5EE22F0C">
           <v:shapetype id="_x0000_t75" coordsize="21600,21600" o:spt="75" o:preferrelative="t" path="m@4@5l@4@11@9@11@9@5xe" filled="f" stroked="f">
             <v:stroke joinstyle="miter"/>
             <v:formulas>
@@ -8221,7 +8221,7 @@
           <v:shape id="_x0000_i1027" type="#_x0000_t75" alt="" style="width:411.95pt;height:165.25pt;mso-width-percent:0;mso-height-percent:0;mso-width-percent:0;mso-height-percent:0" o:ole="">
             <v:imagedata r:id="rId15" o:title=""/>
           </v:shape>
-          <o:OLEObject Type="Embed" ProgID="Visio.Drawing.15" ShapeID="_x0000_i1027" DrawAspect="Content" ObjectID="_1837598215" r:id="rId16"/>
+          <o:OLEObject Type="Embed" ProgID="Visio.Drawing.15" ShapeID="_x0000_i1027" DrawAspect="Content" ObjectID="_1837601209" r:id="rId16"/>
         </w:object>
       </w:r>
     </w:p>
@@ -9188,11 +9188,11 @@
           <w:noProof/>
           <w:sz w:val="22"/>
         </w:rPr>
-        <w:object w:dxaOrig="7310" w:dyaOrig="900" w14:anchorId="7070E2E5">
+        <w:object w:dxaOrig="7310" w:dyaOrig="900" w14:anchorId="135C4266">
           <v:shape id="_x0000_i1026" type="#_x0000_t75" alt="" style="width:365.9pt;height:46.05pt;mso-width-percent:0;mso-height-percent:0;mso-width-percent:0;mso-height-percent:0" o:ole="">
             <v:imagedata r:id="rId17" o:title=""/>
           </v:shape>
-          <o:OLEObject Type="Embed" ProgID="Visio.Drawing.15" ShapeID="_x0000_i1026" DrawAspect="Content" ObjectID="_1837598216" r:id="rId18"/>
+          <o:OLEObject Type="Embed" ProgID="Visio.Drawing.15" ShapeID="_x0000_i1026" DrawAspect="Content" ObjectID="_1837601210" r:id="rId18"/>
         </w:object>
       </w:r>
     </w:p>
@@ -11282,11 +11282,11 @@
         <w:rPr>
           <w:noProof/>
         </w:rPr>
-        <w:object w:dxaOrig="6880" w:dyaOrig="7151" w14:anchorId="58293901">
+        <w:object w:dxaOrig="6880" w:dyaOrig="7151" w14:anchorId="22405EAE">
           <v:shape id="_x0000_i1025" type="#_x0000_t75" alt="" style="width:344.05pt;height:5in;mso-width-percent:0;mso-height-percent:0;mso-width-percent:0;mso-height-percent:0" o:ole="">
             <v:imagedata r:id="rId25" o:title=""/>
           </v:shape>
-          <o:OLEObject Type="Embed" ProgID="Visio.Drawing.15" ShapeID="_x0000_i1025" DrawAspect="Content" ObjectID="_1837598217" r:id="rId26"/>
+          <o:OLEObject Type="Embed" ProgID="Visio.Drawing.15" ShapeID="_x0000_i1025" DrawAspect="Content" ObjectID="_1837601211" r:id="rId26"/>
         </w:object>
       </w:r>
     </w:p>
@@ -26045,6 +26045,15 @@
           <w:bCs/>
           <w:sz w:val="22"/>
         </w:rPr>
+        <w:t>图像</w:t>
+      </w:r>
+      <w:r>
+        <w:rPr>
+          <w:rFonts w:eastAsiaTheme="minorHAnsi" w:cs="Calibri" w:hint="eastAsia"/>
+          <w:b/>
+          <w:bCs/>
+          <w:sz w:val="22"/>
+        </w:rPr>
         <w:t>数据：</w:t>
       </w:r>
       <w:r>
@@ -26052,21 +26061,14 @@
           <w:rFonts w:eastAsiaTheme="minorHAnsi" w:cs="Calibri" w:hint="eastAsia"/>
           <w:sz w:val="22"/>
         </w:rPr>
-        <w:t>将需要推送的图像转换为Bitm</w:t>
+        <w:t>支持Bitmap格式的像素数组（BGRA32和BGR24两种格式），</w:t>
       </w:r>
       <w:r>
         <w:rPr>
           <w:rFonts w:eastAsiaTheme="minorHAnsi" w:cs="Calibri" w:hint="eastAsia"/>
           <w:sz w:val="22"/>
         </w:rPr>
-        <w:t>a</w:t>
-      </w:r>
-      <w:r>
-        <w:rPr>
-          <w:rFonts w:eastAsiaTheme="minorHAnsi" w:cs="Calibri" w:hint="eastAsia"/>
-          <w:sz w:val="22"/>
-        </w:rPr>
-        <w:t>p格式（RGBA模式）后读取的Bitmap的Bytes数组，使用GZip压缩算法。</w:t>
+        <w:t>亦支持Bmp、Jpeg、Png等图片文件。支持GZip压缩算法，此时Compress需要设置为True。</w:t>
       </w:r>
     </w:p>
     <w:p>
@@ -41893,12 +41895,12 @@
             </w:pPr>
             <w:r>
               <w:rPr>
-                <w:rFonts w:eastAsia="Times New Roman" w:cs="Calibri"/>
+                <w:rFonts w:eastAsiaTheme="minorHAnsi" w:cs="Calibri"/>
                 <w:color w:val="000000" w:themeColor="text1"/>
                 <w:kern w:val="0"/>
                 <w:sz w:val="22"/>
               </w:rPr>
-              <w:t>ET0240C-D0</w:t>
+              <w:t>ET0430-91</w:t>
             </w:r>
           </w:p>
         </w:tc>
@@ -41930,7 +41932,7 @@
                 <w:color w:val="000000"/>
                 <w:sz w:val="22"/>
               </w:rPr>
-              <w:t>2.4</w:t>
+              <w:t>4.3</w:t>
             </w:r>
           </w:p>
         </w:tc>
@@ -41959,12 +41961,12 @@
             </w:pPr>
             <w:r>
               <w:rPr>
-                <w:rFonts w:eastAsia="Times New Roman" w:cs="Calibri"/>
+                <w:rFonts w:eastAsiaTheme="minorHAnsi" w:cs="Calibri"/>
                 <w:color w:val="000000" w:themeColor="text1"/>
                 <w:kern w:val="0"/>
                 <w:sz w:val="22"/>
               </w:rPr>
-              <w:t>TFT</w:t>
+              <w:t>Eink</w:t>
             </w:r>
           </w:p>
         </w:tc>
@@ -41994,13 +41996,13 @@
             </w:pPr>
             <w:r>
               <w:rPr>
-                <w:rFonts w:eastAsia="Times New Roman" w:cs="Calibri"/>
+                <w:rFonts w:eastAsiaTheme="minorHAnsi" w:cs="Calibri"/>
                 <w:color w:val="000000" w:themeColor="text1"/>
                 <w:kern w:val="0"/>
                 <w:sz w:val="22"/>
                 <w:lang w:val="en-CA"/>
               </w:rPr>
-              <w:t>Full Color?</w:t>
+              <w:t>B/W/R/Y</w:t>
             </w:r>
           </w:p>
         </w:tc>
@@ -42032,7 +42034,7 @@
                 <w:color w:val="000000"/>
                 <w:sz w:val="22"/>
               </w:rPr>
-              <w:t>320*240</w:t>
+              <w:t>522*152</w:t>
             </w:r>
           </w:p>
         </w:tc>
@@ -42061,7 +42063,7 @@
             </w:pPr>
             <w:r>
               <w:rPr>
-                <w:rFonts w:eastAsia="Times New Roman" w:cs="Calibri"/>
+                <w:rFonts w:eastAsiaTheme="minorHAnsi" w:cs="Calibri"/>
                 <w:color w:val="000000" w:themeColor="text1"/>
                 <w:kern w:val="0"/>
                 <w:sz w:val="22"/>
@@ -42098,6 +42100,15 @@
                 <w:sz w:val="22"/>
               </w:rPr>
             </w:pPr>
+            <w:r>
+              <w:rPr>
+                <w:rFonts w:eastAsia="Times New Roman" w:cs="Calibri"/>
+                <w:color w:val="000000" w:themeColor="text1"/>
+                <w:kern w:val="0"/>
+                <w:sz w:val="22"/>
+              </w:rPr>
+              <w:t>ET0730-A0</w:t>
+            </w:r>
           </w:p>
         </w:tc>
         <w:tc>
@@ -42122,6 +42133,14 @@
                 <w:sz w:val="22"/>
               </w:rPr>
             </w:pPr>
+            <w:r>
+              <w:rPr>
+                <w:rFonts w:ascii="DengXian" w:eastAsia="DengXian" w:hAnsi="DengXian"/>
+                <w:color w:val="000000"/>
+                <w:sz w:val="22"/>
+              </w:rPr>
+              <w:t>7.3</w:t>
+            </w:r>
           </w:p>
         </w:tc>
         <w:tc>
@@ -42147,6 +42166,15 @@
                 <w:sz w:val="22"/>
               </w:rPr>
             </w:pPr>
+            <w:r>
+              <w:rPr>
+                <w:rFonts w:eastAsia="Times New Roman" w:cs="Calibri"/>
+                <w:color w:val="000000" w:themeColor="text1"/>
+                <w:kern w:val="0"/>
+                <w:sz w:val="22"/>
+              </w:rPr>
+              <w:t>Eink</w:t>
+            </w:r>
           </w:p>
         </w:tc>
         <w:tc>
@@ -42173,6 +42201,16 @@
                 <w:lang w:val="en-CA"/>
               </w:rPr>
             </w:pPr>
+            <w:r>
+              <w:rPr>
+                <w:rFonts w:eastAsia="Times New Roman" w:cs="Calibri"/>
+                <w:color w:val="000000" w:themeColor="text1"/>
+                <w:kern w:val="0"/>
+                <w:sz w:val="22"/>
+                <w:lang w:val="en-CA"/>
+              </w:rPr>
+              <w:t>6-Color</w:t>
+            </w:r>
           </w:p>
         </w:tc>
         <w:tc>
@@ -42197,6 +42235,14 @@
                 <w:sz w:val="22"/>
               </w:rPr>
             </w:pPr>
+            <w:r>
+              <w:rPr>
+                <w:rFonts w:ascii="DengXian" w:eastAsia="DengXian" w:hAnsi="DengXian"/>
+                <w:color w:val="000000"/>
+                <w:sz w:val="22"/>
+              </w:rPr>
+              <w:t>800*480</w:t>
+            </w:r>
           </w:p>
         </w:tc>
         <w:tc>
@@ -42222,6 +42268,15 @@
                 <w:sz w:val="22"/>
               </w:rPr>
             </w:pPr>
+            <w:r>
+              <w:rPr>
+                <w:rFonts w:eastAsia="Times New Roman" w:cs="Calibri"/>
+                <w:color w:val="000000" w:themeColor="text1"/>
+                <w:kern w:val="0"/>
+                <w:sz w:val="22"/>
+              </w:rPr>
+              <w:t>-</w:t>
+            </w:r>
           </w:p>
         </w:tc>
       </w:tr>
@@ -42252,6 +42307,15 @@
                 <w:sz w:val="22"/>
               </w:rPr>
             </w:pPr>
+            <w:r>
+              <w:rPr>
+                <w:rFonts w:eastAsia="Times New Roman" w:cs="Calibri"/>
+                <w:color w:val="000000" w:themeColor="text1"/>
+                <w:kern w:val="0"/>
+                <w:sz w:val="22"/>
+              </w:rPr>
+              <w:t>ET1330-A1</w:t>
+            </w:r>
           </w:p>
         </w:tc>
         <w:tc>
@@ -42276,6 +42340,14 @@
                 <w:sz w:val="22"/>
               </w:rPr>
             </w:pPr>
+            <w:r>
+              <w:rPr>
+                <w:rFonts w:ascii="DengXian" w:eastAsia="DengXian" w:hAnsi="DengXian"/>
+                <w:color w:val="000000"/>
+                <w:sz w:val="22"/>
+              </w:rPr>
+              <w:t>13.3</w:t>
+            </w:r>
           </w:p>
         </w:tc>
         <w:tc>
@@ -42301,6 +42373,15 @@
                 <w:sz w:val="22"/>
               </w:rPr>
             </w:pPr>
+            <w:r>
+              <w:rPr>
+                <w:rFonts w:eastAsia="Times New Roman" w:cs="Calibri"/>
+                <w:color w:val="000000" w:themeColor="text1"/>
+                <w:kern w:val="0"/>
+                <w:sz w:val="22"/>
+              </w:rPr>
+              <w:t>Eink</w:t>
+            </w:r>
           </w:p>
         </w:tc>
         <w:tc>
@@ -42327,6 +42408,16 @@
                 <w:lang w:val="en-CA"/>
               </w:rPr>
             </w:pPr>
+            <w:r>
+              <w:rPr>
+                <w:rFonts w:eastAsia="Times New Roman" w:cs="Calibri"/>
+                <w:color w:val="000000" w:themeColor="text1"/>
+                <w:kern w:val="0"/>
+                <w:sz w:val="22"/>
+                <w:lang w:val="en-CA"/>
+              </w:rPr>
+              <w:t>6-Color</w:t>
+            </w:r>
           </w:p>
         </w:tc>
         <w:tc>
@@ -42351,6 +42442,14 @@
                 <w:sz w:val="22"/>
               </w:rPr>
             </w:pPr>
+            <w:r>
+              <w:rPr>
+                <w:rFonts w:ascii="DengXian" w:eastAsia="DengXian" w:hAnsi="DengXian"/>
+                <w:color w:val="000000"/>
+                <w:sz w:val="22"/>
+              </w:rPr>
+              <w:t>1600*1200</w:t>
+            </w:r>
           </w:p>
         </w:tc>
         <w:tc>
@@ -42376,6 +42475,222 @@
                 <w:sz w:val="22"/>
               </w:rPr>
             </w:pPr>
+            <w:r>
+              <w:rPr>
+                <w:rFonts w:eastAsia="Times New Roman" w:cs="Calibri"/>
+                <w:color w:val="000000" w:themeColor="text1"/>
+                <w:kern w:val="0"/>
+                <w:sz w:val="22"/>
+              </w:rPr>
+              <w:t>-</w:t>
+            </w:r>
+          </w:p>
+        </w:tc>
+      </w:tr>
+      <w:tr>
+        <w:trPr>
+          <w:trHeight w:val="349"/>
+        </w:trPr>
+        <w:tc>
+          <w:tcPr>
+            <w:tcW w:w="938" w:type="pct"/>
+            <w:tcBorders>
+              <w:top w:val="single" w:sz="4" w:space="0" w:color="auto"/>
+              <w:left w:val="single" w:sz="4" w:space="0" w:color="auto"/>
+              <w:bottom w:val="single" w:sz="4" w:space="0" w:color="auto"/>
+              <w:right w:val="single" w:sz="4" w:space="0" w:color="auto"/>
+            </w:tcBorders>
+            <w:noWrap/>
+            <w:vAlign w:val="center"/>
+          </w:tcPr>
+          <w:p>
+            <w:pPr>
+              <w:widowControl/>
+              <w:jc w:val="center"/>
+              <w:rPr>
+                <w:rFonts w:eastAsia="Times New Roman" w:cs="Calibri"/>
+                <w:color w:val="000000" w:themeColor="text1"/>
+                <w:kern w:val="0"/>
+                <w:sz w:val="22"/>
+              </w:rPr>
+            </w:pPr>
+            <w:r>
+              <w:rPr>
+                <w:rFonts w:eastAsia="Times New Roman" w:cs="Calibri"/>
+                <w:color w:val="000000" w:themeColor="text1"/>
+                <w:kern w:val="0"/>
+                <w:sz w:val="22"/>
+              </w:rPr>
+              <w:t>ET0240C-D0</w:t>
+            </w:r>
+          </w:p>
+        </w:tc>
+        <w:tc>
+          <w:tcPr>
+            <w:tcW w:w="939" w:type="pct"/>
+            <w:tcBorders>
+              <w:top w:val="single" w:sz="4" w:space="0" w:color="auto"/>
+              <w:left w:val="nil"/>
+              <w:bottom w:val="single" w:sz="4" w:space="0" w:color="auto"/>
+              <w:right w:val="single" w:sz="4" w:space="0" w:color="auto"/>
+            </w:tcBorders>
+            <w:noWrap/>
+            <w:vAlign w:val="center"/>
+          </w:tcPr>
+          <w:p>
+            <w:pPr>
+              <w:widowControl/>
+              <w:jc w:val="center"/>
+              <w:rPr>
+                <w:rFonts w:ascii="DengXian" w:eastAsia="DengXian" w:hAnsi="DengXian"/>
+                <w:color w:val="000000"/>
+                <w:sz w:val="22"/>
+              </w:rPr>
+            </w:pPr>
+            <w:r>
+              <w:rPr>
+                <w:rFonts w:ascii="DengXian" w:eastAsia="DengXian" w:hAnsi="DengXian"/>
+                <w:color w:val="000000"/>
+                <w:sz w:val="22"/>
+              </w:rPr>
+              <w:t>2.4</w:t>
+            </w:r>
+          </w:p>
+        </w:tc>
+        <w:tc>
+          <w:tcPr>
+            <w:tcW w:w="684" w:type="pct"/>
+            <w:tcBorders>
+              <w:top w:val="single" w:sz="4" w:space="0" w:color="auto"/>
+              <w:left w:val="nil"/>
+              <w:bottom w:val="single" w:sz="4" w:space="0" w:color="auto"/>
+              <w:right w:val="single" w:sz="4" w:space="0" w:color="auto"/>
+            </w:tcBorders>
+            <w:noWrap/>
+            <w:vAlign w:val="center"/>
+          </w:tcPr>
+          <w:p>
+            <w:pPr>
+              <w:widowControl/>
+              <w:jc w:val="center"/>
+              <w:rPr>
+                <w:rFonts w:eastAsia="Times New Roman" w:cs="Calibri"/>
+                <w:color w:val="000000" w:themeColor="text1"/>
+                <w:kern w:val="0"/>
+                <w:sz w:val="22"/>
+              </w:rPr>
+            </w:pPr>
+            <w:r>
+              <w:rPr>
+                <w:rFonts w:eastAsia="Times New Roman" w:cs="Calibri"/>
+                <w:color w:val="000000" w:themeColor="text1"/>
+                <w:kern w:val="0"/>
+                <w:sz w:val="22"/>
+              </w:rPr>
+              <w:t>TFT</w:t>
+            </w:r>
+          </w:p>
+        </w:tc>
+        <w:tc>
+          <w:tcPr>
+            <w:tcW w:w="774" w:type="pct"/>
+            <w:tcBorders>
+              <w:top w:val="single" w:sz="4" w:space="0" w:color="auto"/>
+              <w:left w:val="nil"/>
+              <w:bottom w:val="single" w:sz="4" w:space="0" w:color="auto"/>
+              <w:right w:val="single" w:sz="4" w:space="0" w:color="auto"/>
+            </w:tcBorders>
+            <w:noWrap/>
+            <w:vAlign w:val="center"/>
+          </w:tcPr>
+          <w:p>
+            <w:pPr>
+              <w:widowControl/>
+              <w:jc w:val="center"/>
+              <w:rPr>
+                <w:rFonts w:eastAsia="Times New Roman" w:cs="Calibri"/>
+                <w:color w:val="000000" w:themeColor="text1"/>
+                <w:kern w:val="0"/>
+                <w:sz w:val="22"/>
+                <w:lang w:val="en-CA"/>
+              </w:rPr>
+            </w:pPr>
+            <w:r>
+              <w:rPr>
+                <w:rFonts w:eastAsia="Times New Roman" w:cs="Calibri"/>
+                <w:color w:val="000000" w:themeColor="text1"/>
+                <w:kern w:val="0"/>
+                <w:sz w:val="22"/>
+                <w:lang w:val="en-CA"/>
+              </w:rPr>
+              <w:t>Full Color?</w:t>
+            </w:r>
+          </w:p>
+        </w:tc>
+        <w:tc>
+          <w:tcPr>
+            <w:tcW w:w="934" w:type="pct"/>
+            <w:tcBorders>
+              <w:top w:val="single" w:sz="4" w:space="0" w:color="auto"/>
+              <w:left w:val="nil"/>
+              <w:bottom w:val="single" w:sz="4" w:space="0" w:color="auto"/>
+              <w:right w:val="single" w:sz="4" w:space="0" w:color="auto"/>
+            </w:tcBorders>
+            <w:noWrap/>
+            <w:vAlign w:val="center"/>
+          </w:tcPr>
+          <w:p>
+            <w:pPr>
+              <w:widowControl/>
+              <w:jc w:val="center"/>
+              <w:rPr>
+                <w:rFonts w:ascii="DengXian" w:eastAsia="DengXian" w:hAnsi="DengXian"/>
+                <w:color w:val="000000"/>
+                <w:sz w:val="22"/>
+              </w:rPr>
+            </w:pPr>
+            <w:r>
+              <w:rPr>
+                <w:rFonts w:ascii="DengXian" w:eastAsia="DengXian" w:hAnsi="DengXian"/>
+                <w:color w:val="000000"/>
+                <w:sz w:val="22"/>
+              </w:rPr>
+              <w:t>320*240</w:t>
+            </w:r>
+          </w:p>
+        </w:tc>
+        <w:tc>
+          <w:tcPr>
+            <w:tcW w:w="731" w:type="pct"/>
+            <w:tcBorders>
+              <w:top w:val="single" w:sz="4" w:space="0" w:color="auto"/>
+              <w:left w:val="nil"/>
+              <w:bottom w:val="single" w:sz="4" w:space="0" w:color="auto"/>
+              <w:right w:val="single" w:sz="4" w:space="0" w:color="auto"/>
+            </w:tcBorders>
+            <w:noWrap/>
+            <w:vAlign w:val="center"/>
+          </w:tcPr>
+          <w:p>
+            <w:pPr>
+              <w:widowControl/>
+              <w:jc w:val="center"/>
+              <w:rPr>
+                <w:rFonts w:eastAsia="Times New Roman" w:cs="Calibri"/>
+                <w:color w:val="000000" w:themeColor="text1"/>
+                <w:kern w:val="0"/>
+                <w:sz w:val="22"/>
+              </w:rPr>
+            </w:pPr>
+            <w:r>
+              <w:rPr>
+                <w:rFonts w:eastAsia="Times New Roman" w:cs="Calibri"/>
+                <w:color w:val="000000" w:themeColor="text1"/>
+                <w:kern w:val="0"/>
+                <w:sz w:val="22"/>
+              </w:rPr>
+              <w:t>-</w:t>
+            </w:r>
           </w:p>
         </w:tc>
       </w:tr>
@@ -42384,10 +42699,45 @@
       <w:pPr>
         <w:ind w:firstLine="420"/>
         <w:rPr>
+          <w:rFonts w:eastAsiaTheme="minorHAnsi"/>
+        </w:rPr>
+      </w:pPr>
+      <w:r>
+        <w:rPr>
+          <w:rFonts w:eastAsiaTheme="minorHAnsi" w:cs="Calibri" w:hint="eastAsia"/>
+          <w:sz w:val="22"/>
+          <w:szCs w:val="24"/>
+        </w:rPr>
+        <w:t>注意</w:t>
+      </w:r>
+      <w:r>
+        <w:rPr>
           <w:rFonts w:eastAsiaTheme="minorHAnsi" w:cs="Calibri"/>
           <w:sz w:val="22"/>
           <w:szCs w:val="24"/>
         </w:rPr>
+        <w:t>:</w:t>
+      </w:r>
+      <w:r>
+        <w:rPr>
+          <w:rFonts w:eastAsiaTheme="minorHAnsi" w:hint="eastAsia"/>
+        </w:rPr>
+        <w:t xml:space="preserve"> </w:t>
+      </w:r>
+    </w:p>
+    <w:p>
+      <w:pPr>
+        <w:pStyle w:val="ListParagraph"/>
+        <w:numPr>
+          <w:ilvl w:val="0"/>
+          <w:numId w:val="37"/>
+        </w:numPr>
+        <w:ind w:firstLineChars="0"/>
+        <w:rPr>
+          <w:rFonts w:eastAsiaTheme="minorHAnsi" w:cs="Calibri"/>
+          <w:sz w:val="22"/>
+          <w:szCs w:val="24"/>
+        </w:rPr>
       </w:pPr>
       <w:r>
         <w:rPr>
@@ -42395,7 +42745,7 @@
           <w:sz w:val="22"/>
           <w:szCs w:val="24"/>
         </w:rPr>
-        <w:t>注意</w:t>
+        <w:t>在颜色栏中，</w:t>
       </w:r>
       <w:r>
         <w:rPr>
@@ -42403,13 +42753,7 @@
           <w:sz w:val="22"/>
           <w:szCs w:val="24"/>
         </w:rPr>
-        <w:t>:</w:t>
-      </w:r>
-      <w:r>
-        <w:rPr>
-          <w:rFonts w:eastAsiaTheme="minorHAnsi" w:hint="eastAsia"/>
-        </w:rPr>
-        <w:t xml:space="preserve"> </w:t>
+        <w:t>B表示黑色，W表示白色，R表示红色，Y表示黄色</w:t>
       </w:r>
       <w:r>
         <w:rPr>
@@ -42417,23 +42761,30 @@
           <w:sz w:val="22"/>
           <w:szCs w:val="24"/>
         </w:rPr>
-        <w:t>在颜色栏中，</w:t>
-      </w:r>
-      <w:r>
-        <w:rPr>
-          <w:rFonts w:eastAsiaTheme="minorHAnsi" w:cs="Calibri"/>
+        <w:t>。</w:t>
+      </w:r>
+    </w:p>
+    <w:p>
+      <w:pPr>
+        <w:pStyle w:val="ListParagraph"/>
+        <w:numPr>
+          <w:ilvl w:val="0"/>
+          <w:numId w:val="37"/>
+        </w:numPr>
+        <w:ind w:firstLineChars="0"/>
+        <w:rPr>
+          <w:rFonts w:eastAsiaTheme="minorHAnsi" w:cs="Calibri" w:hint="eastAsia"/>
           <w:sz w:val="22"/>
           <w:szCs w:val="24"/>
         </w:rPr>
-        <w:t>B表示黑色，W表示白色，R表示红色，Y表示黄色</w:t>
-      </w:r>
+      </w:pPr>
       <w:r>
         <w:rPr>
           <w:rFonts w:eastAsiaTheme="minorHAnsi" w:cs="Calibri" w:hint="eastAsia"/>
           <w:sz w:val="22"/>
           <w:szCs w:val="24"/>
         </w:rPr>
-        <w:t>。</w:t>
+        <w:t>在颜色栏中，6-Color表示黑白红黄绿蓝。</w:t>
       </w:r>
     </w:p>
     <w:p>
@@ -42550,6 +42901,7 @@
                 <w:kern w:val="0"/>
                 <w:sz w:val="22"/>
               </w:rPr>
+              <w:lastRenderedPageBreak/>
               <w:t>UpdateDisplay</w:t>
             </w:r>
           </w:p>
@@ -42731,7 +43083,6 @@
                 <w:rFonts w:eastAsiaTheme="minorHAnsi" w:cs="Calibri"/>
                 <w:sz w:val="22"/>
               </w:rPr>
-              <w:lastRenderedPageBreak/>
               <w:t>LED</w:t>
             </w:r>
           </w:p>
@@ -44484,6 +44835,7 @@
                 <w:sz w:val="19"/>
                 <w:szCs w:val="19"/>
               </w:rPr>
+              <w:lastRenderedPageBreak/>
               <w:t>[MessagePackObject]</w:t>
             </w:r>
           </w:p>
@@ -44588,7 +44940,6 @@
                 <w:sz w:val="19"/>
                 <w:szCs w:val="19"/>
               </w:rPr>
-              <w:lastRenderedPageBreak/>
               <w:t xml:space="preserve">    /// ID: Code4 </w:t>
             </w:r>
           </w:p>
@@ -45915,6 +46266,7 @@
                 <w:sz w:val="19"/>
                 <w:szCs w:val="19"/>
               </w:rPr>
+              <w:lastRenderedPageBreak/>
               <w:t xml:space="preserve">    /// &lt;/summary&gt;</w:t>
             </w:r>
           </w:p>
@@ -46019,7 +46371,6 @@
                 <w:sz w:val="19"/>
                 <w:szCs w:val="19"/>
               </w:rPr>
-              <w:lastRenderedPageBreak/>
               <w:t xml:space="preserve">    /// Auto network</w:t>
             </w:r>
           </w:p>
@@ -47318,6 +47669,7 @@
                 <w:sz w:val="19"/>
                 <w:szCs w:val="19"/>
               </w:rPr>
+              <w:lastRenderedPageBreak/>
               <w:t xml:space="preserve">    /// Local IP, empty if auto network</w:t>
             </w:r>
           </w:p>
@@ -47422,7 +47774,6 @@
                 <w:sz w:val="19"/>
                 <w:szCs w:val="19"/>
               </w:rPr>
-              <w:lastRenderedPageBreak/>
               <w:t xml:space="preserve">    /// &lt;summary&gt;</w:t>
             </w:r>
           </w:p>
@@ -48731,6 +49082,7 @@
                 <w:sz w:val="19"/>
                 <w:szCs w:val="19"/>
               </w:rPr>
+              <w:lastRenderedPageBreak/>
               <w:t xml:space="preserve">    public string OldKey { get; set; }</w:t>
             </w:r>
           </w:p>
@@ -48835,7 +49187,6 @@
                 <w:sz w:val="19"/>
                 <w:szCs w:val="19"/>
               </w:rPr>
-              <w:lastRenderedPageBreak/>
               <w:t xml:space="preserve">    public string Base64String { get; set; } = "";</w:t>
             </w:r>
           </w:p>
@@ -50158,6 +50509,7 @@
                 <w:sz w:val="19"/>
                 <w:szCs w:val="19"/>
               </w:rPr>
+              <w:lastRenderedPageBreak/>
               <w:t xml:space="preserve">    public string TagID { get; set; } = string.Empty;</w:t>
             </w:r>
           </w:p>
@@ -50262,7 +50614,6 @@
                 <w:sz w:val="19"/>
                 <w:szCs w:val="19"/>
               </w:rPr>
-              <w:lastRenderedPageBreak/>
               <w:t xml:space="preserve">    [Key(1)]</w:t>
             </w:r>
           </w:p>
@@ -51843,6 +52194,96 @@
 <file path=word/numbering.xml><?xml version="1.0" encoding="utf-8"?>
 <w:numbering xmlns:wpc="http://schemas.microsoft.com/office/word/2010/wordprocessingCanvas" xmlns:cx="http://schemas.microsoft.com/office/drawing/2014/chartex" xmlns:cx1="http://schemas.microsoft.com/office/drawing/2015/9/8/chartex" xmlns:cx2="http://schemas.microsoft.com/office/drawing/2015/10/21/chartex" xmlns:cx3="http://schemas.microsoft.com/office/drawing/2016/5/9/chartex" xmlns:cx4="http://schemas.microsoft.com/office/drawing/2016/5/10/chartex" xmlns:cx5="http://schemas.microsoft.com/office/drawing/2016/5/11/chartex" xmlns:cx6="http://schemas.microsoft.com/office/drawing/2016/5/12/chartex" xmlns:cx7="http://schemas.microsoft.com/office/drawing/2016/5/13/chartex" xmlns:cx8="http://schemas.microsoft.com/office/drawing/2016/5/14/chartex" xmlns:mc="http://schemas.openxmlformats.org/markup-compatibility/2006" xmlns:aink="http://schemas.microsoft.com/office/drawing/2016/ink" xmlns:am3d="http://schemas.microsoft.com/office/drawing/2017/model3d" xmlns:o="urn:schemas-microsoft-com:office:office" xmlns:oel="http://schemas.microsoft.com/office/2019/extlst" xmlns:r="http://schemas.openxmlformats.org/officeDocument/2006/relationships" xmlns:m="http://schemas.openxmlformats.org/officeDocument/2006/math" xmlns:v="urn:schemas-microsoft-com:vml" xmlns:wp14="http://schemas.microsoft.com/office/word/2010/wordprocessingDrawing" xmlns:wp="http://schemas.openxmlformats.org/drawingml/2006/wordprocessingDrawing" xmlns:w10="urn:schemas-microsoft-com:office:word" xmlns:w="http://schemas.openxmlformats.org/wordprocessingml/2006/main" xmlns:w14="http://schemas.microsoft.com/office/word/2010/wordml" xmlns:w15="http://schemas.microsoft.com/office/word/2012/wordml" xmlns:w16cex="http://schemas.microsoft.com/office/word/2018/wordml/cex" xmlns:w16cid="http://schemas.microsoft.com/office/word/2016/wordml/cid" xmlns:w16="http://schemas.microsoft.com/office/word/2018/wordml" xmlns:w16du="http://schemas.microsoft.com/office/word/2023/wordml/word16du" xmlns:w16sdtdh="http://schemas.microsoft.com/office/word/2020/wordml/sdtdatahash" xmlns:w16sdtfl="http://schemas.microsoft.com/office/word/2024/wordml/sdtformatlock" xmlns:w16se="http://schemas.microsoft.com/office/word/2015/wordml/symex" xmlns:wpg="http://schemas.microsoft.com/office/word/2010/wordprocessingGroup" xmlns:wpi="http://schemas.microsoft.com/office/word/2010/wordprocessingInk" xmlns:wne="http://schemas.microsoft.com/office/word/2006/wordml" xmlns:wps="http://schemas.microsoft.com/office/word/2010/wordprocessingShape" mc:Ignorable="w14 w15 w16se w16cid w16 w16cex w16sdtdh w16sdtfl w16du wp14">
   <w:abstractNum w:abstractNumId="0" w15:restartNumberingAfterBreak="0">
+    <w:nsid w:val="004E4DBF"/>
+    <w:multiLevelType w:val="hybridMultilevel"/>
+    <w:tmpl w:val="9126ED62"/>
+    <w:lvl w:ilvl="0" w:tplc="2C763A5E">
+      <w:start w:val="1"/>
+      <w:numFmt w:val="decimal"/>
+      <w:lvlText w:val="%1."/>
+      <w:lvlJc w:val="left"/>
+      <w:pPr>
+        <w:ind w:left="720" w:hanging="360"/>
+      </w:pPr>
+      <w:rPr>
+        <w:rFonts w:cstheme="minorBidi" w:hint="default"/>
+        <w:sz w:val="21"/>
+      </w:rPr>
+    </w:lvl>
+    <w:lvl w:ilvl="1" w:tplc="04090019" w:tentative="1">
+      <w:start w:val="1"/>
+      <w:numFmt w:val="lowerLetter"/>
+      <w:lvlText w:val="%2."/>
+      <w:lvlJc w:val="left"/>
+      <w:pPr>
+        <w:ind w:left="1440" w:hanging="360"/>
+      </w:pPr>
+    </w:lvl>
+    <w:lvl w:ilvl="2" w:tplc="0409001B" w:tentative="1">
+      <w:start w:val="1"/>
+      <w:numFmt w:val="lowerRoman"/>
+      <w:lvlText w:val="%3."/>
+      <w:lvlJc w:val="right"/>
+      <w:pPr>
+        <w:ind w:left="2160" w:hanging="180"/>
+      </w:pPr>
+    </w:lvl>
+    <w:lvl w:ilvl="3" w:tplc="0409000F" w:tentative="1">
+      <w:start w:val="1"/>
+      <w:numFmt w:val="decimal"/>
+      <w:lvlText w:val="%4."/>
+      <w:lvlJc w:val="left"/>
+      <w:pPr>
+        <w:ind w:left="2880" w:hanging="360"/>
+      </w:pPr>
+    </w:lvl>
+    <w:lvl w:ilvl="4" w:tplc="04090019" w:tentative="1">
+      <w:start w:val="1"/>
+      <w:numFmt w:val="lowerLetter"/>
+      <w:lvlText w:val="%5."/>
+      <w:lvlJc w:val="left"/>
+      <w:pPr>
+        <w:ind w:left="3600" w:hanging="360"/>
+      </w:pPr>
+    </w:lvl>
+    <w:lvl w:ilvl="5" w:tplc="0409001B" w:tentative="1">
+      <w:start w:val="1"/>
+      <w:numFmt w:val="lowerRoman"/>
+      <w:lvlText w:val="%6."/>
+      <w:lvlJc w:val="right"/>
+      <w:pPr>
+        <w:ind w:left="4320" w:hanging="180"/>
+      </w:pPr>
+    </w:lvl>
+    <w:lvl w:ilvl="6" w:tplc="0409000F" w:tentative="1">
+      <w:start w:val="1"/>
+      <w:numFmt w:val="decimal"/>
+      <w:lvlText w:val="%7."/>
+      <w:lvlJc w:val="left"/>
+      <w:pPr>
+        <w:ind w:left="5040" w:hanging="360"/>
+      </w:pPr>
+    </w:lvl>
+    <w:lvl w:ilvl="7" w:tplc="04090019" w:tentative="1">
+      <w:start w:val="1"/>
+      <w:numFmt w:val="lowerLetter"/>
+      <w:lvlText w:val="%8."/>
+      <w:lvlJc w:val="left"/>
+      <w:pPr>
+        <w:ind w:left="5760" w:hanging="360"/>
+      </w:pPr>
+    </w:lvl>
+    <w:lvl w:ilvl="8" w:tplc="0409001B" w:tentative="1">
+      <w:start w:val="1"/>
+      <w:numFmt w:val="lowerRoman"/>
+      <w:lvlText w:val="%9."/>
+      <w:lvlJc w:val="right"/>
+      <w:pPr>
+        <w:ind w:left="6480" w:hanging="180"/>
+      </w:pPr>
+    </w:lvl>
+  </w:abstractNum>
+  <w:abstractNum w:abstractNumId="1" w15:restartNumberingAfterBreak="0">
     <w:nsid w:val="07173BD1"/>
     <w:multiLevelType w:val="multilevel"/>
     <w:tmpl w:val="202A3092"/>
@@ -51931,7 +52372,7 @@
       </w:pPr>
     </w:lvl>
   </w:abstractNum>
-  <w:abstractNum w:abstractNumId="1" w15:restartNumberingAfterBreak="0">
+  <w:abstractNum w:abstractNumId="2" w15:restartNumberingAfterBreak="0">
     <w:nsid w:val="094F3E19"/>
     <w:multiLevelType w:val="hybridMultilevel"/>
     <w:tmpl w:val="1792B6F8"/>
@@ -52046,7 +52487,7 @@
       </w:rPr>
     </w:lvl>
   </w:abstractNum>
-  <w:abstractNum w:abstractNumId="2" w15:restartNumberingAfterBreak="0">
+  <w:abstractNum w:abstractNumId="3" w15:restartNumberingAfterBreak="0">
     <w:nsid w:val="0C497B06"/>
     <w:multiLevelType w:val="multilevel"/>
     <w:tmpl w:val="0C497B06"/>
@@ -52135,7 +52576,7 @@
       </w:pPr>
     </w:lvl>
   </w:abstractNum>
-  <w:abstractNum w:abstractNumId="3" w15:restartNumberingAfterBreak="0">
+  <w:abstractNum w:abstractNumId="4" w15:restartNumberingAfterBreak="0">
     <w:nsid w:val="0EC67B5F"/>
     <w:multiLevelType w:val="multilevel"/>
     <w:tmpl w:val="0EC67B5F"/>
@@ -52225,7 +52666,7 @@
       </w:pPr>
     </w:lvl>
   </w:abstractNum>
-  <w:abstractNum w:abstractNumId="4" w15:restartNumberingAfterBreak="0">
+  <w:abstractNum w:abstractNumId="5" w15:restartNumberingAfterBreak="0">
     <w:nsid w:val="0FEF7E14"/>
     <w:multiLevelType w:val="hybridMultilevel"/>
     <w:tmpl w:val="02EEB7D2"/>
@@ -52314,7 +52755,7 @@
       </w:pPr>
     </w:lvl>
   </w:abstractNum>
-  <w:abstractNum w:abstractNumId="5" w15:restartNumberingAfterBreak="0">
+  <w:abstractNum w:abstractNumId="6" w15:restartNumberingAfterBreak="0">
     <w:nsid w:val="110A6DBB"/>
     <w:multiLevelType w:val="multilevel"/>
     <w:tmpl w:val="541F6CF3"/>
@@ -52403,7 +52844,7 @@
       </w:pPr>
     </w:lvl>
   </w:abstractNum>
-  <w:abstractNum w:abstractNumId="6" w15:restartNumberingAfterBreak="0">
+  <w:abstractNum w:abstractNumId="7" w15:restartNumberingAfterBreak="0">
     <w:nsid w:val="123B03D4"/>
     <w:multiLevelType w:val="multilevel"/>
     <w:tmpl w:val="541F6CF3"/>
@@ -52492,7 +52933,7 @@
       </w:pPr>
     </w:lvl>
   </w:abstractNum>
-  <w:abstractNum w:abstractNumId="7" w15:restartNumberingAfterBreak="0">
+  <w:abstractNum w:abstractNumId="8" w15:restartNumberingAfterBreak="0">
     <w:nsid w:val="13C067B6"/>
     <w:multiLevelType w:val="multilevel"/>
     <w:tmpl w:val="202A3092"/>
@@ -52581,7 +53022,7 @@
       </w:pPr>
     </w:lvl>
   </w:abstractNum>
-  <w:abstractNum w:abstractNumId="8" w15:restartNumberingAfterBreak="0">
+  <w:abstractNum w:abstractNumId="9" w15:restartNumberingAfterBreak="0">
     <w:nsid w:val="14A53053"/>
     <w:multiLevelType w:val="multilevel"/>
     <w:tmpl w:val="331C38CE"/>
@@ -52696,7 +53137,7 @@
       </w:rPr>
     </w:lvl>
   </w:abstractNum>
-  <w:abstractNum w:abstractNumId="9" w15:restartNumberingAfterBreak="0">
+  <w:abstractNum w:abstractNumId="10" w15:restartNumberingAfterBreak="0">
     <w:nsid w:val="19AD44B3"/>
     <w:multiLevelType w:val="hybridMultilevel"/>
     <w:tmpl w:val="DD245F52"/>
@@ -52785,7 +53226,7 @@
       </w:pPr>
     </w:lvl>
   </w:abstractNum>
-  <w:abstractNum w:abstractNumId="10" w15:restartNumberingAfterBreak="0">
+  <w:abstractNum w:abstractNumId="11" w15:restartNumberingAfterBreak="0">
     <w:nsid w:val="1B873D19"/>
     <w:multiLevelType w:val="multilevel"/>
     <w:tmpl w:val="767E1CDC"/>
@@ -52873,7 +53314,7 @@
       </w:pPr>
     </w:lvl>
   </w:abstractNum>
-  <w:abstractNum w:abstractNumId="11" w15:restartNumberingAfterBreak="0">
+  <w:abstractNum w:abstractNumId="12" w15:restartNumberingAfterBreak="0">
     <w:nsid w:val="1CA17F3F"/>
     <w:multiLevelType w:val="multilevel"/>
     <w:tmpl w:val="14A53053"/>
@@ -52965,7 +53406,7 @@
       </w:pPr>
     </w:lvl>
   </w:abstractNum>
-  <w:abstractNum w:abstractNumId="12" w15:restartNumberingAfterBreak="0">
+  <w:abstractNum w:abstractNumId="13" w15:restartNumberingAfterBreak="0">
     <w:nsid w:val="1DF87ABB"/>
     <w:multiLevelType w:val="multilevel"/>
     <w:tmpl w:val="541F6CF3"/>
@@ -53054,7 +53495,7 @@
       </w:pPr>
     </w:lvl>
   </w:abstractNum>
-  <w:abstractNum w:abstractNumId="13" w15:restartNumberingAfterBreak="0">
+  <w:abstractNum w:abstractNumId="14" w15:restartNumberingAfterBreak="0">
     <w:nsid w:val="1E8B039C"/>
     <w:multiLevelType w:val="multilevel"/>
     <w:tmpl w:val="EF621B56"/>
@@ -53143,7 +53584,7 @@
       </w:pPr>
     </w:lvl>
   </w:abstractNum>
-  <w:abstractNum w:abstractNumId="14" w15:restartNumberingAfterBreak="0">
+  <w:abstractNum w:abstractNumId="15" w15:restartNumberingAfterBreak="0">
     <w:nsid w:val="23B92F32"/>
     <w:multiLevelType w:val="hybridMultilevel"/>
     <w:tmpl w:val="0B5036F6"/>
@@ -53258,7 +53699,7 @@
       </w:rPr>
     </w:lvl>
   </w:abstractNum>
-  <w:abstractNum w:abstractNumId="15" w15:restartNumberingAfterBreak="0">
+  <w:abstractNum w:abstractNumId="16" w15:restartNumberingAfterBreak="0">
     <w:nsid w:val="261535C4"/>
     <w:multiLevelType w:val="multilevel"/>
     <w:tmpl w:val="541F6CF3"/>
@@ -53347,7 +53788,7 @@
       </w:pPr>
     </w:lvl>
   </w:abstractNum>
-  <w:abstractNum w:abstractNumId="16" w15:restartNumberingAfterBreak="0">
+  <w:abstractNum w:abstractNumId="17" w15:restartNumberingAfterBreak="0">
     <w:nsid w:val="28736CA0"/>
     <w:multiLevelType w:val="multilevel"/>
     <w:tmpl w:val="541F6CF3"/>
@@ -53436,7 +53877,7 @@
       </w:pPr>
     </w:lvl>
   </w:abstractNum>
-  <w:abstractNum w:abstractNumId="17" w15:restartNumberingAfterBreak="0">
+  <w:abstractNum w:abstractNumId="18" w15:restartNumberingAfterBreak="0">
     <w:nsid w:val="2C3815EB"/>
     <w:multiLevelType w:val="multilevel"/>
     <w:tmpl w:val="202A3092"/>
@@ -53525,7 +53966,7 @@
       </w:pPr>
     </w:lvl>
   </w:abstractNum>
-  <w:abstractNum w:abstractNumId="18" w15:restartNumberingAfterBreak="0">
+  <w:abstractNum w:abstractNumId="19" w15:restartNumberingAfterBreak="0">
     <w:nsid w:val="322C11EA"/>
     <w:multiLevelType w:val="multilevel"/>
     <w:tmpl w:val="202A3092"/>
@@ -53614,7 +54055,7 @@
       </w:pPr>
     </w:lvl>
   </w:abstractNum>
-  <w:abstractNum w:abstractNumId="19" w15:restartNumberingAfterBreak="0">
+  <w:abstractNum w:abstractNumId="20" w15:restartNumberingAfterBreak="0">
     <w:nsid w:val="37A0245C"/>
     <w:multiLevelType w:val="hybridMultilevel"/>
     <w:tmpl w:val="0B5036F6"/>
@@ -53729,7 +54170,7 @@
       </w:rPr>
     </w:lvl>
   </w:abstractNum>
-  <w:abstractNum w:abstractNumId="20" w15:restartNumberingAfterBreak="0">
+  <w:abstractNum w:abstractNumId="21" w15:restartNumberingAfterBreak="0">
     <w:nsid w:val="3874069D"/>
     <w:multiLevelType w:val="hybridMultilevel"/>
     <w:tmpl w:val="D23E2FCA"/>
@@ -53842,7 +54283,7 @@
       </w:rPr>
     </w:lvl>
   </w:abstractNum>
-  <w:abstractNum w:abstractNumId="21" w15:restartNumberingAfterBreak="0">
+  <w:abstractNum w:abstractNumId="22" w15:restartNumberingAfterBreak="0">
     <w:nsid w:val="46F146DC"/>
     <w:multiLevelType w:val="hybridMultilevel"/>
     <w:tmpl w:val="34FC12FE"/>
@@ -53955,7 +54396,7 @@
       </w:rPr>
     </w:lvl>
   </w:abstractNum>
-  <w:abstractNum w:abstractNumId="22" w15:restartNumberingAfterBreak="0">
+  <w:abstractNum w:abstractNumId="23" w15:restartNumberingAfterBreak="0">
     <w:nsid w:val="49F61F41"/>
     <w:multiLevelType w:val="hybridMultilevel"/>
     <w:tmpl w:val="C2FCC4FE"/>
@@ -54045,7 +54486,7 @@
       </w:pPr>
     </w:lvl>
   </w:abstractNum>
-  <w:abstractNum w:abstractNumId="23" w15:restartNumberingAfterBreak="0">
+  <w:abstractNum w:abstractNumId="24" w15:restartNumberingAfterBreak="0">
     <w:nsid w:val="4E1372B8"/>
     <w:multiLevelType w:val="multilevel"/>
     <w:tmpl w:val="4E1372B8"/>
@@ -54133,7 +54574,7 @@
       </w:pPr>
     </w:lvl>
   </w:abstractNum>
-  <w:abstractNum w:abstractNumId="24" w15:restartNumberingAfterBreak="0">
+  <w:abstractNum w:abstractNumId="25" w15:restartNumberingAfterBreak="0">
     <w:nsid w:val="4E8803B3"/>
     <w:multiLevelType w:val="hybridMultilevel"/>
     <w:tmpl w:val="49C44358"/>
@@ -54246,7 +54687,7 @@
       </w:rPr>
     </w:lvl>
   </w:abstractNum>
-  <w:abstractNum w:abstractNumId="25" w15:restartNumberingAfterBreak="0">
+  <w:abstractNum w:abstractNumId="26" w15:restartNumberingAfterBreak="0">
     <w:nsid w:val="541F6CF3"/>
     <w:multiLevelType w:val="multilevel"/>
     <w:tmpl w:val="541F6CF3"/>
@@ -54335,7 +54776,7 @@
       </w:pPr>
     </w:lvl>
   </w:abstractNum>
-  <w:abstractNum w:abstractNumId="26" w15:restartNumberingAfterBreak="0">
+  <w:abstractNum w:abstractNumId="27" w15:restartNumberingAfterBreak="0">
     <w:nsid w:val="57D01FAF"/>
     <w:multiLevelType w:val="multilevel"/>
     <w:tmpl w:val="202A3092"/>
@@ -54424,7 +54865,7 @@
       </w:pPr>
     </w:lvl>
   </w:abstractNum>
-  <w:abstractNum w:abstractNumId="27" w15:restartNumberingAfterBreak="0">
+  <w:abstractNum w:abstractNumId="28" w15:restartNumberingAfterBreak="0">
     <w:nsid w:val="5B0D5616"/>
     <w:multiLevelType w:val="multilevel"/>
     <w:tmpl w:val="5B0D5616"/>
@@ -54537,7 +54978,7 @@
       </w:rPr>
     </w:lvl>
   </w:abstractNum>
-  <w:abstractNum w:abstractNumId="28" w15:restartNumberingAfterBreak="0">
+  <w:abstractNum w:abstractNumId="29" w15:restartNumberingAfterBreak="0">
     <w:nsid w:val="5EDA26DF"/>
     <w:multiLevelType w:val="hybridMultilevel"/>
     <w:tmpl w:val="0B5036F6"/>
@@ -54652,7 +55093,7 @@
       </w:rPr>
     </w:lvl>
   </w:abstractNum>
-  <w:abstractNum w:abstractNumId="29" w15:restartNumberingAfterBreak="0">
+  <w:abstractNum w:abstractNumId="30" w15:restartNumberingAfterBreak="0">
     <w:nsid w:val="625764B0"/>
     <w:multiLevelType w:val="multilevel"/>
     <w:tmpl w:val="202A3092"/>
@@ -54741,7 +55182,7 @@
       </w:pPr>
     </w:lvl>
   </w:abstractNum>
-  <w:abstractNum w:abstractNumId="30" w15:restartNumberingAfterBreak="0">
+  <w:abstractNum w:abstractNumId="31" w15:restartNumberingAfterBreak="0">
     <w:nsid w:val="6301682F"/>
     <w:multiLevelType w:val="multilevel"/>
     <w:tmpl w:val="6301682F"/>
@@ -54854,7 +55295,7 @@
       </w:rPr>
     </w:lvl>
   </w:abstractNum>
-  <w:abstractNum w:abstractNumId="31" w15:restartNumberingAfterBreak="0">
+  <w:abstractNum w:abstractNumId="32" w15:restartNumberingAfterBreak="0">
     <w:nsid w:val="64B530E0"/>
     <w:multiLevelType w:val="hybridMultilevel"/>
     <w:tmpl w:val="1792B6F8"/>
@@ -54969,7 +55410,7 @@
       </w:rPr>
     </w:lvl>
   </w:abstractNum>
-  <w:abstractNum w:abstractNumId="32" w15:restartNumberingAfterBreak="0">
+  <w:abstractNum w:abstractNumId="33" w15:restartNumberingAfterBreak="0">
     <w:nsid w:val="65302D36"/>
     <w:multiLevelType w:val="hybridMultilevel"/>
     <w:tmpl w:val="6310B37A"/>
@@ -55055,7 +55496,7 @@
       </w:pPr>
     </w:lvl>
   </w:abstractNum>
-  <w:abstractNum w:abstractNumId="33" w15:restartNumberingAfterBreak="0">
+  <w:abstractNum w:abstractNumId="34" w15:restartNumberingAfterBreak="0">
     <w:nsid w:val="6F6B1CD6"/>
     <w:multiLevelType w:val="hybridMultilevel"/>
     <w:tmpl w:val="EC2E4C86"/>
@@ -55141,7 +55582,7 @@
       </w:pPr>
     </w:lvl>
   </w:abstractNum>
-  <w:abstractNum w:abstractNumId="34" w15:restartNumberingAfterBreak="0">
+  <w:abstractNum w:abstractNumId="35" w15:restartNumberingAfterBreak="0">
     <w:nsid w:val="75743F4B"/>
     <w:multiLevelType w:val="multilevel"/>
     <w:tmpl w:val="41746F7C"/>
@@ -55254,7 +55695,7 @@
       </w:rPr>
     </w:lvl>
   </w:abstractNum>
-  <w:abstractNum w:abstractNumId="35" w15:restartNumberingAfterBreak="0">
+  <w:abstractNum w:abstractNumId="36" w15:restartNumberingAfterBreak="0">
     <w:nsid w:val="79C55374"/>
     <w:multiLevelType w:val="multilevel"/>
     <w:tmpl w:val="79C55374"/>
@@ -55344,112 +55785,115 @@
     </w:lvl>
   </w:abstractNum>
   <w:num w:numId="1" w16cid:durableId="474226992">
+    <w:abstractNumId w:val="14"/>
+  </w:num>
+  <w:num w:numId="2" w16cid:durableId="1796833038">
+    <w:abstractNumId w:val="26"/>
+  </w:num>
+  <w:num w:numId="3" w16cid:durableId="1384988187">
+    <w:abstractNumId w:val="9"/>
+  </w:num>
+  <w:num w:numId="4" w16cid:durableId="898249302">
+    <w:abstractNumId w:val="31"/>
+  </w:num>
+  <w:num w:numId="5" w16cid:durableId="1262567815">
+    <w:abstractNumId w:val="28"/>
+  </w:num>
+  <w:num w:numId="6" w16cid:durableId="1703241318">
+    <w:abstractNumId w:val="3"/>
+  </w:num>
+  <w:num w:numId="7" w16cid:durableId="436680516">
+    <w:abstractNumId w:val="36"/>
+  </w:num>
+  <w:num w:numId="8" w16cid:durableId="2089616750">
+    <w:abstractNumId w:val="4"/>
+  </w:num>
+  <w:num w:numId="9" w16cid:durableId="1276406924">
+    <w:abstractNumId w:val="24"/>
+  </w:num>
+  <w:num w:numId="10" w16cid:durableId="355691065">
+    <w:abstractNumId w:val="32"/>
+  </w:num>
+  <w:num w:numId="11" w16cid:durableId="1110271848">
+    <w:abstractNumId w:val="25"/>
+  </w:num>
+  <w:num w:numId="12" w16cid:durableId="1304233745">
+    <w:abstractNumId w:val="21"/>
+  </w:num>
+  <w:num w:numId="13" w16cid:durableId="2033215004">
+    <w:abstractNumId w:val="29"/>
+  </w:num>
+  <w:num w:numId="14" w16cid:durableId="155074512">
+    <w:abstractNumId w:val="1"/>
+  </w:num>
+  <w:num w:numId="15" w16cid:durableId="3408053">
+    <w:abstractNumId w:val="2"/>
+  </w:num>
+  <w:num w:numId="16" w16cid:durableId="2038307530">
+    <w:abstractNumId w:val="12"/>
+  </w:num>
+  <w:num w:numId="17" w16cid:durableId="616565843">
     <w:abstractNumId w:val="13"/>
   </w:num>
-  <w:num w:numId="2" w16cid:durableId="1796833038">
-    <w:abstractNumId w:val="25"/>
+  <w:num w:numId="18" w16cid:durableId="823858593">
+    <w:abstractNumId w:val="33"/>
   </w:num>
-  <w:num w:numId="3" w16cid:durableId="1384988187">
+  <w:num w:numId="19" w16cid:durableId="123699051">
+    <w:abstractNumId w:val="34"/>
+  </w:num>
+  <w:num w:numId="20" w16cid:durableId="1510438508">
+    <w:abstractNumId w:val="10"/>
+  </w:num>
+  <w:num w:numId="21" w16cid:durableId="1336572972">
+    <w:abstractNumId w:val="35"/>
+  </w:num>
+  <w:num w:numId="22" w16cid:durableId="1458643941">
+    <w:abstractNumId w:val="22"/>
+  </w:num>
+  <w:num w:numId="23" w16cid:durableId="215551874">
+    <w:abstractNumId w:val="7"/>
+  </w:num>
+  <w:num w:numId="24" w16cid:durableId="1265311348">
+    <w:abstractNumId w:val="15"/>
+  </w:num>
+  <w:num w:numId="25" w16cid:durableId="1782263279">
+    <w:abstractNumId w:val="6"/>
+  </w:num>
+  <w:num w:numId="26" w16cid:durableId="215895401">
+    <w:abstractNumId w:val="17"/>
+  </w:num>
+  <w:num w:numId="27" w16cid:durableId="301204426">
+    <w:abstractNumId w:val="20"/>
+  </w:num>
+  <w:num w:numId="28" w16cid:durableId="802314312">
+    <w:abstractNumId w:val="5"/>
+  </w:num>
+  <w:num w:numId="29" w16cid:durableId="2128548511">
+    <w:abstractNumId w:val="18"/>
+  </w:num>
+  <w:num w:numId="30" w16cid:durableId="113989894">
     <w:abstractNumId w:val="8"/>
   </w:num>
-  <w:num w:numId="4" w16cid:durableId="898249302">
+  <w:num w:numId="31" w16cid:durableId="1782645396">
+    <w:abstractNumId w:val="19"/>
+  </w:num>
+  <w:num w:numId="32" w16cid:durableId="321858062">
     <w:abstractNumId w:val="30"/>
   </w:num>
-  <w:num w:numId="5" w16cid:durableId="1262567815">
+  <w:num w:numId="33" w16cid:durableId="1121995744">
     <w:abstractNumId w:val="27"/>
   </w:num>
-  <w:num w:numId="6" w16cid:durableId="1703241318">
-    <w:abstractNumId w:val="2"/>
+  <w:num w:numId="34" w16cid:durableId="1574005418">
+    <w:abstractNumId w:val="16"/>
   </w:num>
-  <w:num w:numId="7" w16cid:durableId="436680516">
-    <w:abstractNumId w:val="35"/>
+  <w:num w:numId="35" w16cid:durableId="594820969">
+    <w:abstractNumId w:val="11"/>
   </w:num>
-  <w:num w:numId="8" w16cid:durableId="2089616750">
-    <w:abstractNumId w:val="3"/>
-  </w:num>
-  <w:num w:numId="9" w16cid:durableId="1276406924">
+  <w:num w:numId="36" w16cid:durableId="1377268316">
     <w:abstractNumId w:val="23"/>
   </w:num>
-  <w:num w:numId="10" w16cid:durableId="355691065">
-    <w:abstractNumId w:val="31"/>
-  </w:num>
-  <w:num w:numId="11" w16cid:durableId="1110271848">
-    <w:abstractNumId w:val="24"/>
-  </w:num>
-  <w:num w:numId="12" w16cid:durableId="1304233745">
-    <w:abstractNumId w:val="20"/>
-  </w:num>
-  <w:num w:numId="13" w16cid:durableId="2033215004">
-    <w:abstractNumId w:val="28"/>
-  </w:num>
-  <w:num w:numId="14" w16cid:durableId="155074512">
+  <w:num w:numId="37" w16cid:durableId="393353768">
     <w:abstractNumId w:val="0"/>
-  </w:num>
-  <w:num w:numId="15" w16cid:durableId="3408053">
-    <w:abstractNumId w:val="1"/>
-  </w:num>
-  <w:num w:numId="16" w16cid:durableId="2038307530">
-    <w:abstractNumId w:val="11"/>
-  </w:num>
-  <w:num w:numId="17" w16cid:durableId="616565843">
-    <w:abstractNumId w:val="12"/>
-  </w:num>
-  <w:num w:numId="18" w16cid:durableId="823858593">
-    <w:abstractNumId w:val="32"/>
-  </w:num>
-  <w:num w:numId="19" w16cid:durableId="123699051">
-    <w:abstractNumId w:val="33"/>
-  </w:num>
-  <w:num w:numId="20" w16cid:durableId="1510438508">
-    <w:abstractNumId w:val="9"/>
-  </w:num>
-  <w:num w:numId="21" w16cid:durableId="1336572972">
-    <w:abstractNumId w:val="34"/>
-  </w:num>
-  <w:num w:numId="22" w16cid:durableId="1458643941">
-    <w:abstractNumId w:val="21"/>
-  </w:num>
-  <w:num w:numId="23" w16cid:durableId="215551874">
-    <w:abstractNumId w:val="6"/>
-  </w:num>
-  <w:num w:numId="24" w16cid:durableId="1265311348">
-    <w:abstractNumId w:val="14"/>
-  </w:num>
-  <w:num w:numId="25" w16cid:durableId="1782263279">
-    <w:abstractNumId w:val="5"/>
-  </w:num>
-  <w:num w:numId="26" w16cid:durableId="215895401">
-    <w:abstractNumId w:val="16"/>
-  </w:num>
-  <w:num w:numId="27" w16cid:durableId="301204426">
-    <w:abstractNumId w:val="19"/>
-  </w:num>
-  <w:num w:numId="28" w16cid:durableId="802314312">
-    <w:abstractNumId w:val="4"/>
-  </w:num>
-  <w:num w:numId="29" w16cid:durableId="2128548511">
-    <w:abstractNumId w:val="17"/>
-  </w:num>
-  <w:num w:numId="30" w16cid:durableId="113989894">
-    <w:abstractNumId w:val="7"/>
-  </w:num>
-  <w:num w:numId="31" w16cid:durableId="1782645396">
-    <w:abstractNumId w:val="18"/>
-  </w:num>
-  <w:num w:numId="32" w16cid:durableId="321858062">
-    <w:abstractNumId w:val="29"/>
-  </w:num>
-  <w:num w:numId="33" w16cid:durableId="1121995744">
-    <w:abstractNumId w:val="26"/>
-  </w:num>
-  <w:num w:numId="34" w16cid:durableId="1574005418">
-    <w:abstractNumId w:val="15"/>
-  </w:num>
-  <w:num w:numId="35" w16cid:durableId="594820969">
-    <w:abstractNumId w:val="10"/>
-  </w:num>
-  <w:num w:numId="36" w16cid:durableId="1377268316">
-    <w:abstractNumId w:val="22"/>
   </w:num>
 </w:numbering>
 </file>

</xml_diff>